<commit_message>
FEAT: Ryan natural disaster exploration
</commit_message>
<xml_diff>
--- a/Ryan/Coursework/DatasetMerges.docx
+++ b/Ryan/Coursework/DatasetMerges.docx
@@ -50,9 +50,120 @@
           <w:ilvl w:val="0"/>
           <w:numId w:val="4"/>
         </w:numPr>
-      </w:pPr>
-      <w:r>
-        <w:t>Poverty stats.</w:t>
+        <w:rPr>
+          <w:b/>
+          <w:bCs/>
+          <w:u w:val="single"/>
+        </w:rPr>
+      </w:pPr>
+      <w:r>
+        <w:t>Poverty stats</w:t>
+      </w:r>
+      <w:r>
+        <w:t xml:space="preserve"> </w:t>
+      </w:r>
+    </w:p>
+    <w:p>
+      <w:hyperlink r:id="rId7" w:history="1">
+        <w:r>
+          <w:rPr>
+            <w:rStyle w:val="Hyperlink"/>
+          </w:rPr>
+          <w:t>Poverty and Inequality Platform</w:t>
+        </w:r>
+      </w:hyperlink>
+    </w:p>
+    <w:p>
+      <w:pPr>
+        <w:pStyle w:val="ListParagraph"/>
+        <w:numPr>
+          <w:ilvl w:val="0"/>
+          <w:numId w:val="4"/>
+        </w:numPr>
+        <w:rPr>
+          <w:b/>
+          <w:bCs/>
+          <w:u w:val="single"/>
+        </w:rPr>
+      </w:pPr>
+      <w:r>
+        <w:t>Contains global stats for poverty rate and inequality indicators that we could easily match up with our dataset,</w:t>
+      </w:r>
+    </w:p>
+    <w:p>
+      <w:pPr>
+        <w:pStyle w:val="ListParagraph"/>
+        <w:numPr>
+          <w:ilvl w:val="0"/>
+          <w:numId w:val="4"/>
+        </w:numPr>
+        <w:rPr>
+          <w:b/>
+          <w:bCs/>
+          <w:u w:val="single"/>
+        </w:rPr>
+      </w:pPr>
+      <w:r>
+        <w:t>Data collected by the ‘World Bank’ (</w:t>
+      </w:r>
+      <w:hyperlink r:id="rId8" w:history="1">
+        <w:r>
+          <w:rPr>
+            <w:rStyle w:val="Hyperlink"/>
+          </w:rPr>
+          <w:t>World Bank Group - International Development, Poverty and Sustainability</w:t>
+        </w:r>
+      </w:hyperlink>
+      <w:r>
+        <w:t>). It is an international development bank that makes leveraged loans to developing countries, hence the dataset is trustworthy,</w:t>
+      </w:r>
+    </w:p>
+    <w:p>
+      <w:pPr>
+        <w:pStyle w:val="ListParagraph"/>
+        <w:numPr>
+          <w:ilvl w:val="0"/>
+          <w:numId w:val="4"/>
+        </w:numPr>
+        <w:rPr>
+          <w:b/>
+          <w:bCs/>
+          <w:u w:val="single"/>
+        </w:rPr>
+      </w:pPr>
+      <w:r>
+        <w:t>It contains many estimates using data they have collected through a variety of means (</w:t>
+      </w:r>
+      <w:hyperlink r:id="rId9" w:anchor="step-3-converting-welfare-aggregates" w:history="1">
+        <w:r>
+          <w:rPr>
+            <w:rStyle w:val="Hyperlink"/>
+          </w:rPr>
+          <w:t>Non-technical summary | Poverty and Inequality Platform Methodology Handbook</w:t>
+        </w:r>
+      </w:hyperlink>
+      <w:r>
+        <w:t>)</w:t>
+      </w:r>
+      <w:r>
+        <w:t>,</w:t>
+      </w:r>
+    </w:p>
+    <w:p>
+      <w:pPr>
+        <w:pStyle w:val="ListParagraph"/>
+        <w:numPr>
+          <w:ilvl w:val="0"/>
+          <w:numId w:val="4"/>
+        </w:numPr>
+        <w:rPr>
+          <w:b/>
+          <w:bCs/>
+          <w:u w:val="single"/>
+        </w:rPr>
+      </w:pPr>
+      <w:r>
+        <w:t>Covers nearly the entire same period, starting in 1981.</w:t>
       </w:r>
     </w:p>
     <w:p>
@@ -90,7 +201,20 @@
         </w:numPr>
       </w:pPr>
       <w:r>
-        <w:t>Carbon emissions,</w:t>
+        <w:t>Wildfires</w:t>
+      </w:r>
+    </w:p>
+    <w:p>
+      <w:hyperlink r:id="rId10" w:history="1">
+        <w:r>
+          <w:rPr>
+            <w:rStyle w:val="Hyperlink"/>
+          </w:rPr>
+          <w:t>Datasets - Leverhulme Wildfires Centre Leverhulme Wildfires Centre</w:t>
+        </w:r>
+      </w:hyperlink>
+      <w:r>
+        <w:t xml:space="preserve"> </w:t>
       </w:r>
     </w:p>
     <w:p>
@@ -102,8 +226,112 @@
         </w:numPr>
       </w:pPr>
       <w:r>
-        <w:t>Wildfires,</w:t>
-      </w:r>
+        <w:t xml:space="preserve">contains </w:t>
+      </w:r>
+      <w:r>
+        <w:t>numerous datasets from different sources</w:t>
+      </w:r>
+      <w:r>
+        <w:t xml:space="preserve"> </w:t>
+      </w:r>
+      <w:r>
+        <w:t>surrounding man-made fire use. For example:</w:t>
+      </w:r>
+    </w:p>
+    <w:p>
+      <w:pPr>
+        <w:pStyle w:val="ListParagraph"/>
+        <w:numPr>
+          <w:ilvl w:val="1"/>
+          <w:numId w:val="1"/>
+        </w:numPr>
+      </w:pPr>
+      <w:hyperlink r:id="rId11" w:history="1">
+        <w:r>
+          <w:rPr>
+            <w:rStyle w:val="Hyperlink"/>
+          </w:rPr>
+          <w:t>Collection - Global Fire Use Survey - Geography - Figshare</w:t>
+        </w:r>
+      </w:hyperlink>
+    </w:p>
+    <w:p>
+      <w:pPr>
+        <w:pStyle w:val="ListParagraph"/>
+        <w:numPr>
+          <w:ilvl w:val="1"/>
+          <w:numId w:val="1"/>
+        </w:numPr>
+      </w:pPr>
+      <w:r>
+        <w:t>Data collected by the Royal Holloway University in London and contains many datasets discussing various fire ecology and geography,</w:t>
+      </w:r>
+    </w:p>
+    <w:p>
+      <w:pPr>
+        <w:pStyle w:val="ListParagraph"/>
+        <w:numPr>
+          <w:ilvl w:val="1"/>
+          <w:numId w:val="1"/>
+        </w:numPr>
+      </w:pPr>
+      <w:r>
+        <w:t>A</w:t>
+      </w:r>
+      <w:r>
+        <w:t xml:space="preserve"> lot more </w:t>
+      </w:r>
+      <w:r>
+        <w:t>quantitative</w:t>
+      </w:r>
+      <w:r>
+        <w:t xml:space="preserve"> but it has many global areas </w:t>
+      </w:r>
+      <w:r>
+        <w:t xml:space="preserve">and </w:t>
+      </w:r>
+      <w:r>
+        <w:t>they discuss how they manage and use fire in the area</w:t>
+      </w:r>
+      <w:r>
+        <w:t>,</w:t>
+      </w:r>
+      <w:r>
+        <w:t xml:space="preserve"> </w:t>
+      </w:r>
+    </w:p>
+    <w:p>
+      <w:pPr>
+        <w:pStyle w:val="ListParagraph"/>
+        <w:numPr>
+          <w:ilvl w:val="1"/>
+          <w:numId w:val="1"/>
+        </w:numPr>
+      </w:pPr>
+      <w:r>
+        <w:t>Could have some interesting conclusions but requires a lot of pre-processing</w:t>
+      </w:r>
+      <w:r>
+        <w:t>,</w:t>
+      </w:r>
+    </w:p>
+    <w:p>
+      <w:pPr>
+        <w:pStyle w:val="ListParagraph"/>
+        <w:numPr>
+          <w:ilvl w:val="1"/>
+          <w:numId w:val="1"/>
+        </w:numPr>
+      </w:pPr>
+      <w:r>
+        <w:t>Many years, but due to the quantitative nature, it won’t be as easy to access.</w:t>
+      </w:r>
+    </w:p>
+    <w:p>
+      <w:pPr>
+        <w:pStyle w:val="ListParagraph"/>
+        <w:ind w:left="1440"/>
+      </w:pPr>
     </w:p>
     <w:p>
       <w:pPr>
@@ -114,7 +342,92 @@
         </w:numPr>
       </w:pPr>
       <w:r>
-        <w:t>Air quality.</w:t>
+        <w:t>Carbon emissions and a</w:t>
+      </w:r>
+      <w:r>
+        <w:t>ir quality</w:t>
+      </w:r>
+      <w:r>
+        <w:t xml:space="preserve"> </w:t>
+      </w:r>
+    </w:p>
+    <w:p>
+      <w:hyperlink r:id="rId12" w:history="1">
+        <w:r>
+          <w:rPr>
+            <w:rStyle w:val="Hyperlink"/>
+          </w:rPr>
+          <w:t>OpenAQ Homepage</w:t>
+        </w:r>
+      </w:hyperlink>
+    </w:p>
+    <w:p>
+      <w:pPr>
+        <w:pStyle w:val="ListParagraph"/>
+        <w:numPr>
+          <w:ilvl w:val="0"/>
+          <w:numId w:val="6"/>
+        </w:numPr>
+      </w:pPr>
+      <w:r>
+        <w:lastRenderedPageBreak/>
+        <w:t>Requires API registration to access the data programmatically</w:t>
+      </w:r>
+      <w:r>
+        <w:t>,</w:t>
+      </w:r>
+    </w:p>
+    <w:p>
+      <w:pPr>
+        <w:pStyle w:val="ListParagraph"/>
+        <w:numPr>
+          <w:ilvl w:val="0"/>
+          <w:numId w:val="6"/>
+        </w:numPr>
+      </w:pPr>
+      <w:r>
+        <w:t>Environmental tech nonprofit that gathers air quality data from across the globe into an open-source, open-access data platform,</w:t>
+      </w:r>
+    </w:p>
+    <w:p>
+      <w:pPr>
+        <w:pStyle w:val="ListParagraph"/>
+        <w:numPr>
+          <w:ilvl w:val="0"/>
+          <w:numId w:val="6"/>
+        </w:numPr>
+      </w:pPr>
+      <w:r>
+        <w:t>Missing a few regions, but has many of the 12 locations in our subset of the Met Office data (</w:t>
+      </w:r>
+      <w:hyperlink r:id="rId13" w:history="1">
+        <w:r>
+          <w:rPr>
+            <w:rStyle w:val="Hyperlink"/>
+          </w:rPr>
+          <w:t>OpenAQ Explorer</w:t>
+        </w:r>
+      </w:hyperlink>
+      <w:r>
+        <w:t>)</w:t>
+      </w:r>
+      <w:r>
+        <w:t>,</w:t>
+      </w:r>
+    </w:p>
+    <w:p>
+      <w:pPr>
+        <w:pStyle w:val="ListParagraph"/>
+        <w:numPr>
+          <w:ilvl w:val="0"/>
+          <w:numId w:val="6"/>
+        </w:numPr>
+      </w:pPr>
+      <w:r>
+        <w:t>Only goes back to 2016</w:t>
+      </w:r>
+      <w:r>
+        <w:t xml:space="preserve"> in some areas and has even more limited data in others.</w:t>
       </w:r>
     </w:p>
     <w:p>
@@ -152,6 +465,52 @@
         <w:t>Crop yields and productivity.</w:t>
       </w:r>
     </w:p>
+    <w:p>
+      <w:hyperlink r:id="rId14" w:history="1">
+        <w:r>
+          <w:rPr>
+            <w:rStyle w:val="Hyperlink"/>
+          </w:rPr>
+          <w:t>Yields of key staple crops, World, 1961 to 2024</w:t>
+        </w:r>
+      </w:hyperlink>
+    </w:p>
+    <w:p>
+      <w:pPr>
+        <w:pStyle w:val="ListParagraph"/>
+        <w:numPr>
+          <w:ilvl w:val="0"/>
+          <w:numId w:val="2"/>
+        </w:numPr>
+      </w:pPr>
+      <w:r>
+        <w:t>Lots of data about crop yield and agricultural productivity,</w:t>
+      </w:r>
+    </w:p>
+    <w:p>
+      <w:pPr>
+        <w:pStyle w:val="ListParagraph"/>
+        <w:numPr>
+          <w:ilvl w:val="0"/>
+          <w:numId w:val="2"/>
+        </w:numPr>
+      </w:pPr>
+      <w:r>
+        <w:t>Goes back for the entire date range and contains data for the year range that we have,</w:t>
+      </w:r>
+    </w:p>
+    <w:p>
+      <w:pPr>
+        <w:pStyle w:val="ListParagraph"/>
+        <w:numPr>
+          <w:ilvl w:val="0"/>
+          <w:numId w:val="2"/>
+        </w:numPr>
+      </w:pPr>
+      <w:r>
+        <w:t>Trustworthy as it compiles official sources such as the UN into a centralised data store.</w:t>
+      </w:r>
+    </w:p>
     <w:p/>
     <w:p>
       <w:pPr>
@@ -173,6 +532,69 @@
     <w:p>
       <w:pPr>
         <w:rPr>
+          <w:u w:val="single"/>
+        </w:rPr>
+      </w:pPr>
+      <w:hyperlink r:id="rId15" w:history="1">
+        <w:r>
+          <w:rPr>
+            <w:rStyle w:val="Hyperlink"/>
+          </w:rPr>
+          <w:t>Energy Statistics Data Browser – Data Tools - IEA</w:t>
+        </w:r>
+      </w:hyperlink>
+    </w:p>
+    <w:p>
+      <w:pPr>
+        <w:pStyle w:val="ListParagraph"/>
+        <w:numPr>
+          <w:ilvl w:val="0"/>
+          <w:numId w:val="7"/>
+        </w:numPr>
+      </w:pPr>
+      <w:r>
+        <w:t>Nearly covers the date range, begins in 1990,</w:t>
+      </w:r>
+    </w:p>
+    <w:p>
+      <w:pPr>
+        <w:pStyle w:val="ListParagraph"/>
+        <w:numPr>
+          <w:ilvl w:val="0"/>
+          <w:numId w:val="7"/>
+        </w:numPr>
+      </w:pPr>
+      <w:r>
+        <w:t>Loads of data based on energy and fossil fuel usage by country,</w:t>
+      </w:r>
+    </w:p>
+    <w:p>
+      <w:pPr>
+        <w:pStyle w:val="ListParagraph"/>
+        <w:numPr>
+          <w:ilvl w:val="0"/>
+          <w:numId w:val="7"/>
+        </w:numPr>
+      </w:pPr>
+      <w:r>
+        <w:t>Even has data on low-carbon energy generation,</w:t>
+      </w:r>
+    </w:p>
+    <w:p>
+      <w:pPr>
+        <w:pStyle w:val="ListParagraph"/>
+        <w:numPr>
+          <w:ilvl w:val="0"/>
+          <w:numId w:val="7"/>
+        </w:numPr>
+      </w:pPr>
+      <w:r>
+        <w:t>Comes from the International Energy Agency, a global board that works directly with governments so should be trustworthy.</w:t>
+      </w:r>
+    </w:p>
+    <w:p>
+      <w:pPr>
+        <w:rPr>
           <w:b/>
           <w:bCs/>
           <w:u w:val="single"/>
@@ -221,6 +643,40 @@
       </w:r>
     </w:p>
     <w:p>
+      <w:hyperlink r:id="rId16" w:history="1">
+        <w:r>
+          <w:rPr>
+            <w:rStyle w:val="Hyperlink"/>
+          </w:rPr>
+          <w:t>Data – IRF World Road Statistics</w:t>
+        </w:r>
+      </w:hyperlink>
+    </w:p>
+    <w:p>
+      <w:pPr>
+        <w:pStyle w:val="ListParagraph"/>
+        <w:numPr>
+          <w:ilvl w:val="0"/>
+          <w:numId w:val="8"/>
+        </w:numPr>
+      </w:pPr>
+      <w:r>
+        <w:t>Only covers 2018 to 2023,</w:t>
+      </w:r>
+    </w:p>
+    <w:p>
+      <w:pPr>
+        <w:pStyle w:val="ListParagraph"/>
+        <w:numPr>
+          <w:ilvl w:val="0"/>
+          <w:numId w:val="8"/>
+        </w:numPr>
+      </w:pPr>
+      <w:r>
+        <w:t>Comes from the International Road Federation, which is a non-profit organisation that promotes sustainable transport.</w:t>
+      </w:r>
+    </w:p>
+    <w:p>
       <w:pPr>
         <w:rPr>
           <w:b/>
@@ -228,21 +684,13 @@
           <w:u w:val="single"/>
         </w:rPr>
       </w:pPr>
-    </w:p>
-    <w:p>
-      <w:pPr>
+      <w:r>
         <w:rPr>
           <w:b/>
           <w:bCs/>
           <w:u w:val="single"/>
         </w:rPr>
-      </w:pPr>
-      <w:r>
-        <w:rPr>
-          <w:b/>
-          <w:bCs/>
-          <w:u w:val="single"/>
-        </w:rPr>
+        <w:lastRenderedPageBreak/>
         <w:t>Health:</w:t>
       </w:r>
     </w:p>
@@ -255,16 +703,86 @@
         </w:numPr>
       </w:pPr>
       <w:r>
-        <w:t>Disease stats.</w:t>
-      </w:r>
-    </w:p>
-    <w:p>
-      <w:pPr>
-        <w:rPr>
-          <w:b/>
-          <w:bCs/>
-          <w:u w:val="single"/>
-        </w:rPr>
+        <w:t>Disease stats</w:t>
+      </w:r>
+      <w:r>
+        <w:t xml:space="preserve"> </w:t>
+      </w:r>
+    </w:p>
+    <w:p>
+      <w:hyperlink r:id="rId17" w:history="1">
+        <w:r>
+          <w:rPr>
+            <w:rStyle w:val="Hyperlink"/>
+          </w:rPr>
+          <w:t>Data Sets</w:t>
+        </w:r>
+      </w:hyperlink>
+      <w:r>
+        <w:t xml:space="preserve"> – COVID WHO</w:t>
+      </w:r>
+    </w:p>
+    <w:p>
+      <w:pPr>
+        <w:pStyle w:val="ListParagraph"/>
+        <w:numPr>
+          <w:ilvl w:val="0"/>
+          <w:numId w:val="5"/>
+        </w:numPr>
+      </w:pPr>
+      <w:r>
+        <w:t>It’s literally the World Health Organization,</w:t>
+      </w:r>
+    </w:p>
+    <w:p>
+      <w:pPr>
+        <w:pStyle w:val="ListParagraph"/>
+        <w:numPr>
+          <w:ilvl w:val="0"/>
+          <w:numId w:val="5"/>
+        </w:numPr>
+      </w:pPr>
+      <w:r>
+        <w:t>Outside of the date range,</w:t>
+      </w:r>
+    </w:p>
+    <w:p>
+      <w:pPr>
+        <w:pStyle w:val="ListParagraph"/>
+        <w:numPr>
+          <w:ilvl w:val="0"/>
+          <w:numId w:val="5"/>
+        </w:numPr>
+      </w:pPr>
+      <w:r>
+        <w:t>Only has Covid data</w:t>
+      </w:r>
+    </w:p>
+    <w:p>
+      <w:hyperlink r:id="rId18" w:history="1">
+        <w:r>
+          <w:rPr>
+            <w:rStyle w:val="Hyperlink"/>
+          </w:rPr>
+          <w:t>Data at WHO</w:t>
+        </w:r>
+      </w:hyperlink>
+    </w:p>
+    <w:p>
+      <w:pPr>
+        <w:pStyle w:val="ListParagraph"/>
+        <w:numPr>
+          <w:ilvl w:val="0"/>
+          <w:numId w:val="9"/>
+        </w:numPr>
+      </w:pPr>
+      <w:r>
+        <w:t>There is a ton of datasets here for every health concern under the sun and covers a huge date range.</w:t>
+      </w:r>
+    </w:p>
+    <w:p>
+      <w:pPr>
+        <w:pStyle w:val="ListParagraph"/>
       </w:pPr>
     </w:p>
     <w:p>
@@ -293,46 +811,32 @@
         </w:numPr>
       </w:pPr>
       <w:r>
-        <w:t>Tourism stats.</w:t>
-      </w:r>
-    </w:p>
-    <w:p>
-      <w:pPr>
-        <w:rPr>
-          <w:b/>
-          <w:bCs/>
-          <w:u w:val="single"/>
-        </w:rPr>
-      </w:pPr>
-    </w:p>
-    <w:p>
-      <w:pPr>
-        <w:rPr>
-          <w:b/>
-          <w:bCs/>
-          <w:u w:val="single"/>
-        </w:rPr>
-      </w:pPr>
-      <w:r>
-        <w:rPr>
-          <w:b/>
-          <w:bCs/>
-          <w:u w:val="single"/>
-        </w:rPr>
-        <w:t>Social Behaviour:</w:t>
-      </w:r>
+        <w:t>Tourism stats</w:t>
+      </w:r>
+      <w:r>
+        <w:t xml:space="preserve"> </w:t>
+      </w:r>
+    </w:p>
+    <w:p>
+      <w:hyperlink r:id="rId19" w:history="1">
+        <w:r>
+          <w:rPr>
+            <w:rStyle w:val="Hyperlink"/>
+          </w:rPr>
+          <w:t>Tourism - Our World in Data</w:t>
+        </w:r>
+      </w:hyperlink>
     </w:p>
     <w:p>
       <w:pPr>
         <w:pStyle w:val="ListParagraph"/>
         <w:numPr>
           <w:ilvl w:val="0"/>
-          <w:numId w:val="3"/>
-        </w:numPr>
-      </w:pPr>
-      <w:r>
-        <w:lastRenderedPageBreak/>
-        <w:t>Social media,</w:t>
+          <w:numId w:val="5"/>
+        </w:numPr>
+      </w:pPr>
+      <w:r>
+        <w:t>UN data,</w:t>
       </w:r>
     </w:p>
     <w:p>
@@ -340,11 +844,11 @@
         <w:pStyle w:val="ListParagraph"/>
         <w:numPr>
           <w:ilvl w:val="0"/>
-          <w:numId w:val="3"/>
-        </w:numPr>
-      </w:pPr>
-      <w:r>
-        <w:t>Events,</w:t>
+          <w:numId w:val="5"/>
+        </w:numPr>
+      </w:pPr>
+      <w:r>
+        <w:t>Covers the whole date range,</w:t>
       </w:r>
     </w:p>
     <w:p>
@@ -352,15 +856,32 @@
         <w:pStyle w:val="ListParagraph"/>
         <w:numPr>
           <w:ilvl w:val="0"/>
-          <w:numId w:val="3"/>
-        </w:numPr>
-      </w:pPr>
-      <w:r>
-        <w:t>Sports.</w:t>
+          <w:numId w:val="5"/>
+        </w:numPr>
+      </w:pPr>
+      <w:r>
+        <w:t>Has plenty of different locations.</w:t>
+      </w:r>
+    </w:p>
+    <w:p/>
+    <w:p/>
+    <w:p>
+      <w:r>
+        <w:t xml:space="preserve">Natural disaster </w:t>
+      </w:r>
+    </w:p>
+    <w:p>
+      <w:r>
+        <w:t>Poverty</w:t>
+      </w:r>
+    </w:p>
+    <w:p>
+      <w:r>
+        <w:t>WHO</w:t>
       </w:r>
     </w:p>
     <w:sectPr>
-      <w:headerReference w:type="default" r:id="rId7"/>
+      <w:headerReference w:type="default" r:id="rId20"/>
       <w:pgSz w:w="11906" w:h="16838"/>
       <w:pgMar w:top="1440" w:right="1440" w:bottom="1440" w:left="1440" w:header="708" w:footer="708" w:gutter="0"/>
       <w:cols w:space="708"/>
@@ -563,9 +1084,461 @@
     </w:lvl>
   </w:abstractNum>
   <w:abstractNum w:abstractNumId="1" w15:restartNumberingAfterBreak="0">
+    <w:nsid w:val="1ABC4317"/>
+    <w:multiLevelType w:val="hybridMultilevel"/>
+    <w:tmpl w:val="FA705634"/>
+    <w:lvl w:ilvl="0" w:tplc="08090001">
+      <w:start w:val="1"/>
+      <w:numFmt w:val="bullet"/>
+      <w:lvlText w:val=""/>
+      <w:lvlJc w:val="left"/>
+      <w:pPr>
+        <w:ind w:left="720" w:hanging="360"/>
+      </w:pPr>
+      <w:rPr>
+        <w:rFonts w:ascii="Symbol" w:hAnsi="Symbol" w:hint="default"/>
+      </w:rPr>
+    </w:lvl>
+    <w:lvl w:ilvl="1" w:tplc="08090003" w:tentative="1">
+      <w:start w:val="1"/>
+      <w:numFmt w:val="bullet"/>
+      <w:lvlText w:val="o"/>
+      <w:lvlJc w:val="left"/>
+      <w:pPr>
+        <w:ind w:left="1440" w:hanging="360"/>
+      </w:pPr>
+      <w:rPr>
+        <w:rFonts w:ascii="Courier New" w:hAnsi="Courier New" w:cs="Courier New" w:hint="default"/>
+      </w:rPr>
+    </w:lvl>
+    <w:lvl w:ilvl="2" w:tplc="08090005" w:tentative="1">
+      <w:start w:val="1"/>
+      <w:numFmt w:val="bullet"/>
+      <w:lvlText w:val=""/>
+      <w:lvlJc w:val="left"/>
+      <w:pPr>
+        <w:ind w:left="2160" w:hanging="360"/>
+      </w:pPr>
+      <w:rPr>
+        <w:rFonts w:ascii="Wingdings" w:hAnsi="Wingdings" w:hint="default"/>
+      </w:rPr>
+    </w:lvl>
+    <w:lvl w:ilvl="3" w:tplc="08090001" w:tentative="1">
+      <w:start w:val="1"/>
+      <w:numFmt w:val="bullet"/>
+      <w:lvlText w:val=""/>
+      <w:lvlJc w:val="left"/>
+      <w:pPr>
+        <w:ind w:left="2880" w:hanging="360"/>
+      </w:pPr>
+      <w:rPr>
+        <w:rFonts w:ascii="Symbol" w:hAnsi="Symbol" w:hint="default"/>
+      </w:rPr>
+    </w:lvl>
+    <w:lvl w:ilvl="4" w:tplc="08090003" w:tentative="1">
+      <w:start w:val="1"/>
+      <w:numFmt w:val="bullet"/>
+      <w:lvlText w:val="o"/>
+      <w:lvlJc w:val="left"/>
+      <w:pPr>
+        <w:ind w:left="3600" w:hanging="360"/>
+      </w:pPr>
+      <w:rPr>
+        <w:rFonts w:ascii="Courier New" w:hAnsi="Courier New" w:cs="Courier New" w:hint="default"/>
+      </w:rPr>
+    </w:lvl>
+    <w:lvl w:ilvl="5" w:tplc="08090005" w:tentative="1">
+      <w:start w:val="1"/>
+      <w:numFmt w:val="bullet"/>
+      <w:lvlText w:val=""/>
+      <w:lvlJc w:val="left"/>
+      <w:pPr>
+        <w:ind w:left="4320" w:hanging="360"/>
+      </w:pPr>
+      <w:rPr>
+        <w:rFonts w:ascii="Wingdings" w:hAnsi="Wingdings" w:hint="default"/>
+      </w:rPr>
+    </w:lvl>
+    <w:lvl w:ilvl="6" w:tplc="08090001" w:tentative="1">
+      <w:start w:val="1"/>
+      <w:numFmt w:val="bullet"/>
+      <w:lvlText w:val=""/>
+      <w:lvlJc w:val="left"/>
+      <w:pPr>
+        <w:ind w:left="5040" w:hanging="360"/>
+      </w:pPr>
+      <w:rPr>
+        <w:rFonts w:ascii="Symbol" w:hAnsi="Symbol" w:hint="default"/>
+      </w:rPr>
+    </w:lvl>
+    <w:lvl w:ilvl="7" w:tplc="08090003" w:tentative="1">
+      <w:start w:val="1"/>
+      <w:numFmt w:val="bullet"/>
+      <w:lvlText w:val="o"/>
+      <w:lvlJc w:val="left"/>
+      <w:pPr>
+        <w:ind w:left="5760" w:hanging="360"/>
+      </w:pPr>
+      <w:rPr>
+        <w:rFonts w:ascii="Courier New" w:hAnsi="Courier New" w:cs="Courier New" w:hint="default"/>
+      </w:rPr>
+    </w:lvl>
+    <w:lvl w:ilvl="8" w:tplc="08090005" w:tentative="1">
+      <w:start w:val="1"/>
+      <w:numFmt w:val="bullet"/>
+      <w:lvlText w:val=""/>
+      <w:lvlJc w:val="left"/>
+      <w:pPr>
+        <w:ind w:left="6480" w:hanging="360"/>
+      </w:pPr>
+      <w:rPr>
+        <w:rFonts w:ascii="Wingdings" w:hAnsi="Wingdings" w:hint="default"/>
+      </w:rPr>
+    </w:lvl>
+  </w:abstractNum>
+  <w:abstractNum w:abstractNumId="2" w15:restartNumberingAfterBreak="0">
+    <w:nsid w:val="1E723789"/>
+    <w:multiLevelType w:val="hybridMultilevel"/>
+    <w:tmpl w:val="9EE441F6"/>
+    <w:lvl w:ilvl="0" w:tplc="08090001">
+      <w:start w:val="1"/>
+      <w:numFmt w:val="bullet"/>
+      <w:lvlText w:val=""/>
+      <w:lvlJc w:val="left"/>
+      <w:pPr>
+        <w:ind w:left="720" w:hanging="360"/>
+      </w:pPr>
+      <w:rPr>
+        <w:rFonts w:ascii="Symbol" w:hAnsi="Symbol" w:hint="default"/>
+      </w:rPr>
+    </w:lvl>
+    <w:lvl w:ilvl="1" w:tplc="08090003" w:tentative="1">
+      <w:start w:val="1"/>
+      <w:numFmt w:val="bullet"/>
+      <w:lvlText w:val="o"/>
+      <w:lvlJc w:val="left"/>
+      <w:pPr>
+        <w:ind w:left="1440" w:hanging="360"/>
+      </w:pPr>
+      <w:rPr>
+        <w:rFonts w:ascii="Courier New" w:hAnsi="Courier New" w:cs="Courier New" w:hint="default"/>
+      </w:rPr>
+    </w:lvl>
+    <w:lvl w:ilvl="2" w:tplc="08090005" w:tentative="1">
+      <w:start w:val="1"/>
+      <w:numFmt w:val="bullet"/>
+      <w:lvlText w:val=""/>
+      <w:lvlJc w:val="left"/>
+      <w:pPr>
+        <w:ind w:left="2160" w:hanging="360"/>
+      </w:pPr>
+      <w:rPr>
+        <w:rFonts w:ascii="Wingdings" w:hAnsi="Wingdings" w:hint="default"/>
+      </w:rPr>
+    </w:lvl>
+    <w:lvl w:ilvl="3" w:tplc="08090001" w:tentative="1">
+      <w:start w:val="1"/>
+      <w:numFmt w:val="bullet"/>
+      <w:lvlText w:val=""/>
+      <w:lvlJc w:val="left"/>
+      <w:pPr>
+        <w:ind w:left="2880" w:hanging="360"/>
+      </w:pPr>
+      <w:rPr>
+        <w:rFonts w:ascii="Symbol" w:hAnsi="Symbol" w:hint="default"/>
+      </w:rPr>
+    </w:lvl>
+    <w:lvl w:ilvl="4" w:tplc="08090003" w:tentative="1">
+      <w:start w:val="1"/>
+      <w:numFmt w:val="bullet"/>
+      <w:lvlText w:val="o"/>
+      <w:lvlJc w:val="left"/>
+      <w:pPr>
+        <w:ind w:left="3600" w:hanging="360"/>
+      </w:pPr>
+      <w:rPr>
+        <w:rFonts w:ascii="Courier New" w:hAnsi="Courier New" w:cs="Courier New" w:hint="default"/>
+      </w:rPr>
+    </w:lvl>
+    <w:lvl w:ilvl="5" w:tplc="08090005" w:tentative="1">
+      <w:start w:val="1"/>
+      <w:numFmt w:val="bullet"/>
+      <w:lvlText w:val=""/>
+      <w:lvlJc w:val="left"/>
+      <w:pPr>
+        <w:ind w:left="4320" w:hanging="360"/>
+      </w:pPr>
+      <w:rPr>
+        <w:rFonts w:ascii="Wingdings" w:hAnsi="Wingdings" w:hint="default"/>
+      </w:rPr>
+    </w:lvl>
+    <w:lvl w:ilvl="6" w:tplc="08090001" w:tentative="1">
+      <w:start w:val="1"/>
+      <w:numFmt w:val="bullet"/>
+      <w:lvlText w:val=""/>
+      <w:lvlJc w:val="left"/>
+      <w:pPr>
+        <w:ind w:left="5040" w:hanging="360"/>
+      </w:pPr>
+      <w:rPr>
+        <w:rFonts w:ascii="Symbol" w:hAnsi="Symbol" w:hint="default"/>
+      </w:rPr>
+    </w:lvl>
+    <w:lvl w:ilvl="7" w:tplc="08090003" w:tentative="1">
+      <w:start w:val="1"/>
+      <w:numFmt w:val="bullet"/>
+      <w:lvlText w:val="o"/>
+      <w:lvlJc w:val="left"/>
+      <w:pPr>
+        <w:ind w:left="5760" w:hanging="360"/>
+      </w:pPr>
+      <w:rPr>
+        <w:rFonts w:ascii="Courier New" w:hAnsi="Courier New" w:cs="Courier New" w:hint="default"/>
+      </w:rPr>
+    </w:lvl>
+    <w:lvl w:ilvl="8" w:tplc="08090005" w:tentative="1">
+      <w:start w:val="1"/>
+      <w:numFmt w:val="bullet"/>
+      <w:lvlText w:val=""/>
+      <w:lvlJc w:val="left"/>
+      <w:pPr>
+        <w:ind w:left="6480" w:hanging="360"/>
+      </w:pPr>
+      <w:rPr>
+        <w:rFonts w:ascii="Wingdings" w:hAnsi="Wingdings" w:hint="default"/>
+      </w:rPr>
+    </w:lvl>
+  </w:abstractNum>
+  <w:abstractNum w:abstractNumId="3" w15:restartNumberingAfterBreak="0">
+    <w:nsid w:val="1ECF17FD"/>
+    <w:multiLevelType w:val="hybridMultilevel"/>
+    <w:tmpl w:val="18C49002"/>
+    <w:lvl w:ilvl="0" w:tplc="08090001">
+      <w:start w:val="1"/>
+      <w:numFmt w:val="bullet"/>
+      <w:lvlText w:val=""/>
+      <w:lvlJc w:val="left"/>
+      <w:pPr>
+        <w:ind w:left="720" w:hanging="360"/>
+      </w:pPr>
+      <w:rPr>
+        <w:rFonts w:ascii="Symbol" w:hAnsi="Symbol" w:hint="default"/>
+      </w:rPr>
+    </w:lvl>
+    <w:lvl w:ilvl="1" w:tplc="08090003" w:tentative="1">
+      <w:start w:val="1"/>
+      <w:numFmt w:val="bullet"/>
+      <w:lvlText w:val="o"/>
+      <w:lvlJc w:val="left"/>
+      <w:pPr>
+        <w:ind w:left="1440" w:hanging="360"/>
+      </w:pPr>
+      <w:rPr>
+        <w:rFonts w:ascii="Courier New" w:hAnsi="Courier New" w:cs="Courier New" w:hint="default"/>
+      </w:rPr>
+    </w:lvl>
+    <w:lvl w:ilvl="2" w:tplc="08090005" w:tentative="1">
+      <w:start w:val="1"/>
+      <w:numFmt w:val="bullet"/>
+      <w:lvlText w:val=""/>
+      <w:lvlJc w:val="left"/>
+      <w:pPr>
+        <w:ind w:left="2160" w:hanging="360"/>
+      </w:pPr>
+      <w:rPr>
+        <w:rFonts w:ascii="Wingdings" w:hAnsi="Wingdings" w:hint="default"/>
+      </w:rPr>
+    </w:lvl>
+    <w:lvl w:ilvl="3" w:tplc="08090001" w:tentative="1">
+      <w:start w:val="1"/>
+      <w:numFmt w:val="bullet"/>
+      <w:lvlText w:val=""/>
+      <w:lvlJc w:val="left"/>
+      <w:pPr>
+        <w:ind w:left="2880" w:hanging="360"/>
+      </w:pPr>
+      <w:rPr>
+        <w:rFonts w:ascii="Symbol" w:hAnsi="Symbol" w:hint="default"/>
+      </w:rPr>
+    </w:lvl>
+    <w:lvl w:ilvl="4" w:tplc="08090003" w:tentative="1">
+      <w:start w:val="1"/>
+      <w:numFmt w:val="bullet"/>
+      <w:lvlText w:val="o"/>
+      <w:lvlJc w:val="left"/>
+      <w:pPr>
+        <w:ind w:left="3600" w:hanging="360"/>
+      </w:pPr>
+      <w:rPr>
+        <w:rFonts w:ascii="Courier New" w:hAnsi="Courier New" w:cs="Courier New" w:hint="default"/>
+      </w:rPr>
+    </w:lvl>
+    <w:lvl w:ilvl="5" w:tplc="08090005" w:tentative="1">
+      <w:start w:val="1"/>
+      <w:numFmt w:val="bullet"/>
+      <w:lvlText w:val=""/>
+      <w:lvlJc w:val="left"/>
+      <w:pPr>
+        <w:ind w:left="4320" w:hanging="360"/>
+      </w:pPr>
+      <w:rPr>
+        <w:rFonts w:ascii="Wingdings" w:hAnsi="Wingdings" w:hint="default"/>
+      </w:rPr>
+    </w:lvl>
+    <w:lvl w:ilvl="6" w:tplc="08090001" w:tentative="1">
+      <w:start w:val="1"/>
+      <w:numFmt w:val="bullet"/>
+      <w:lvlText w:val=""/>
+      <w:lvlJc w:val="left"/>
+      <w:pPr>
+        <w:ind w:left="5040" w:hanging="360"/>
+      </w:pPr>
+      <w:rPr>
+        <w:rFonts w:ascii="Symbol" w:hAnsi="Symbol" w:hint="default"/>
+      </w:rPr>
+    </w:lvl>
+    <w:lvl w:ilvl="7" w:tplc="08090003" w:tentative="1">
+      <w:start w:val="1"/>
+      <w:numFmt w:val="bullet"/>
+      <w:lvlText w:val="o"/>
+      <w:lvlJc w:val="left"/>
+      <w:pPr>
+        <w:ind w:left="5760" w:hanging="360"/>
+      </w:pPr>
+      <w:rPr>
+        <w:rFonts w:ascii="Courier New" w:hAnsi="Courier New" w:cs="Courier New" w:hint="default"/>
+      </w:rPr>
+    </w:lvl>
+    <w:lvl w:ilvl="8" w:tplc="08090005" w:tentative="1">
+      <w:start w:val="1"/>
+      <w:numFmt w:val="bullet"/>
+      <w:lvlText w:val=""/>
+      <w:lvlJc w:val="left"/>
+      <w:pPr>
+        <w:ind w:left="6480" w:hanging="360"/>
+      </w:pPr>
+      <w:rPr>
+        <w:rFonts w:ascii="Wingdings" w:hAnsi="Wingdings" w:hint="default"/>
+      </w:rPr>
+    </w:lvl>
+  </w:abstractNum>
+  <w:abstractNum w:abstractNumId="4" w15:restartNumberingAfterBreak="0">
+    <w:nsid w:val="2E8A191E"/>
+    <w:multiLevelType w:val="hybridMultilevel"/>
+    <w:tmpl w:val="9D7664E0"/>
+    <w:lvl w:ilvl="0" w:tplc="08090001">
+      <w:start w:val="1"/>
+      <w:numFmt w:val="bullet"/>
+      <w:lvlText w:val=""/>
+      <w:lvlJc w:val="left"/>
+      <w:pPr>
+        <w:ind w:left="720" w:hanging="360"/>
+      </w:pPr>
+      <w:rPr>
+        <w:rFonts w:ascii="Symbol" w:hAnsi="Symbol" w:hint="default"/>
+      </w:rPr>
+    </w:lvl>
+    <w:lvl w:ilvl="1" w:tplc="08090003" w:tentative="1">
+      <w:start w:val="1"/>
+      <w:numFmt w:val="bullet"/>
+      <w:lvlText w:val="o"/>
+      <w:lvlJc w:val="left"/>
+      <w:pPr>
+        <w:ind w:left="1440" w:hanging="360"/>
+      </w:pPr>
+      <w:rPr>
+        <w:rFonts w:ascii="Courier New" w:hAnsi="Courier New" w:cs="Courier New" w:hint="default"/>
+      </w:rPr>
+    </w:lvl>
+    <w:lvl w:ilvl="2" w:tplc="08090005" w:tentative="1">
+      <w:start w:val="1"/>
+      <w:numFmt w:val="bullet"/>
+      <w:lvlText w:val=""/>
+      <w:lvlJc w:val="left"/>
+      <w:pPr>
+        <w:ind w:left="2160" w:hanging="360"/>
+      </w:pPr>
+      <w:rPr>
+        <w:rFonts w:ascii="Wingdings" w:hAnsi="Wingdings" w:hint="default"/>
+      </w:rPr>
+    </w:lvl>
+    <w:lvl w:ilvl="3" w:tplc="08090001" w:tentative="1">
+      <w:start w:val="1"/>
+      <w:numFmt w:val="bullet"/>
+      <w:lvlText w:val=""/>
+      <w:lvlJc w:val="left"/>
+      <w:pPr>
+        <w:ind w:left="2880" w:hanging="360"/>
+      </w:pPr>
+      <w:rPr>
+        <w:rFonts w:ascii="Symbol" w:hAnsi="Symbol" w:hint="default"/>
+      </w:rPr>
+    </w:lvl>
+    <w:lvl w:ilvl="4" w:tplc="08090003" w:tentative="1">
+      <w:start w:val="1"/>
+      <w:numFmt w:val="bullet"/>
+      <w:lvlText w:val="o"/>
+      <w:lvlJc w:val="left"/>
+      <w:pPr>
+        <w:ind w:left="3600" w:hanging="360"/>
+      </w:pPr>
+      <w:rPr>
+        <w:rFonts w:ascii="Courier New" w:hAnsi="Courier New" w:cs="Courier New" w:hint="default"/>
+      </w:rPr>
+    </w:lvl>
+    <w:lvl w:ilvl="5" w:tplc="08090005" w:tentative="1">
+      <w:start w:val="1"/>
+      <w:numFmt w:val="bullet"/>
+      <w:lvlText w:val=""/>
+      <w:lvlJc w:val="left"/>
+      <w:pPr>
+        <w:ind w:left="4320" w:hanging="360"/>
+      </w:pPr>
+      <w:rPr>
+        <w:rFonts w:ascii="Wingdings" w:hAnsi="Wingdings" w:hint="default"/>
+      </w:rPr>
+    </w:lvl>
+    <w:lvl w:ilvl="6" w:tplc="08090001" w:tentative="1">
+      <w:start w:val="1"/>
+      <w:numFmt w:val="bullet"/>
+      <w:lvlText w:val=""/>
+      <w:lvlJc w:val="left"/>
+      <w:pPr>
+        <w:ind w:left="5040" w:hanging="360"/>
+      </w:pPr>
+      <w:rPr>
+        <w:rFonts w:ascii="Symbol" w:hAnsi="Symbol" w:hint="default"/>
+      </w:rPr>
+    </w:lvl>
+    <w:lvl w:ilvl="7" w:tplc="08090003" w:tentative="1">
+      <w:start w:val="1"/>
+      <w:numFmt w:val="bullet"/>
+      <w:lvlText w:val="o"/>
+      <w:lvlJc w:val="left"/>
+      <w:pPr>
+        <w:ind w:left="5760" w:hanging="360"/>
+      </w:pPr>
+      <w:rPr>
+        <w:rFonts w:ascii="Courier New" w:hAnsi="Courier New" w:cs="Courier New" w:hint="default"/>
+      </w:rPr>
+    </w:lvl>
+    <w:lvl w:ilvl="8" w:tplc="08090005" w:tentative="1">
+      <w:start w:val="1"/>
+      <w:numFmt w:val="bullet"/>
+      <w:lvlText w:val=""/>
+      <w:lvlJc w:val="left"/>
+      <w:pPr>
+        <w:ind w:left="6480" w:hanging="360"/>
+      </w:pPr>
+      <w:rPr>
+        <w:rFonts w:ascii="Wingdings" w:hAnsi="Wingdings" w:hint="default"/>
+      </w:rPr>
+    </w:lvl>
+  </w:abstractNum>
+  <w:abstractNum w:abstractNumId="5" w15:restartNumberingAfterBreak="0">
     <w:nsid w:val="30167C56"/>
     <w:multiLevelType w:val="hybridMultilevel"/>
-    <w:tmpl w:val="0824C738"/>
+    <w:tmpl w:val="22B4B3F8"/>
     <w:lvl w:ilvl="0" w:tplc="08090001">
       <w:start w:val="1"/>
       <w:numFmt w:val="bullet"/>
@@ -675,10 +1648,10 @@
       </w:rPr>
     </w:lvl>
   </w:abstractNum>
-  <w:abstractNum w:abstractNumId="2" w15:restartNumberingAfterBreak="0">
+  <w:abstractNum w:abstractNumId="6" w15:restartNumberingAfterBreak="0">
     <w:nsid w:val="571D2B86"/>
     <w:multiLevelType w:val="hybridMultilevel"/>
-    <w:tmpl w:val="E886E120"/>
+    <w:tmpl w:val="E7183D38"/>
     <w:lvl w:ilvl="0" w:tplc="08090001">
       <w:start w:val="1"/>
       <w:numFmt w:val="bullet"/>
@@ -788,10 +1761,10 @@
       </w:rPr>
     </w:lvl>
   </w:abstractNum>
-  <w:abstractNum w:abstractNumId="3" w15:restartNumberingAfterBreak="0">
+  <w:abstractNum w:abstractNumId="7" w15:restartNumberingAfterBreak="0">
     <w:nsid w:val="628C4E7D"/>
     <w:multiLevelType w:val="hybridMultilevel"/>
-    <w:tmpl w:val="9C2CEDD0"/>
+    <w:tmpl w:val="A33A71D4"/>
     <w:lvl w:ilvl="0" w:tplc="08090001">
       <w:start w:val="1"/>
       <w:numFmt w:val="bullet"/>
@@ -804,7 +1777,7 @@
         <w:rFonts w:ascii="Symbol" w:hAnsi="Symbol" w:hint="default"/>
       </w:rPr>
     </w:lvl>
-    <w:lvl w:ilvl="1" w:tplc="08090003" w:tentative="1">
+    <w:lvl w:ilvl="1" w:tplc="08090003">
       <w:start w:val="1"/>
       <w:numFmt w:val="bullet"/>
       <w:lvlText w:val="o"/>
@@ -901,10 +1874,10 @@
       </w:rPr>
     </w:lvl>
   </w:abstractNum>
-  <w:abstractNum w:abstractNumId="4" w15:restartNumberingAfterBreak="0">
+  <w:abstractNum w:abstractNumId="8" w15:restartNumberingAfterBreak="0">
     <w:nsid w:val="74B33E5D"/>
     <w:multiLevelType w:val="hybridMultilevel"/>
-    <w:tmpl w:val="57048B80"/>
+    <w:tmpl w:val="6032F580"/>
     <w:lvl w:ilvl="0" w:tplc="08090001">
       <w:start w:val="1"/>
       <w:numFmt w:val="bullet"/>
@@ -1015,19 +1988,31 @@
     </w:lvl>
   </w:abstractNum>
   <w:num w:numId="1" w16cid:durableId="1912962215">
-    <w:abstractNumId w:val="3"/>
+    <w:abstractNumId w:val="7"/>
   </w:num>
   <w:num w:numId="2" w16cid:durableId="387461081">
-    <w:abstractNumId w:val="2"/>
+    <w:abstractNumId w:val="6"/>
   </w:num>
   <w:num w:numId="3" w16cid:durableId="1823426584">
     <w:abstractNumId w:val="0"/>
   </w:num>
   <w:num w:numId="4" w16cid:durableId="482426429">
+    <w:abstractNumId w:val="8"/>
+  </w:num>
+  <w:num w:numId="5" w16cid:durableId="293101428">
+    <w:abstractNumId w:val="5"/>
+  </w:num>
+  <w:num w:numId="6" w16cid:durableId="165677984">
     <w:abstractNumId w:val="4"/>
   </w:num>
-  <w:num w:numId="5" w16cid:durableId="293101428">
+  <w:num w:numId="7" w16cid:durableId="1722092348">
+    <w:abstractNumId w:val="2"/>
+  </w:num>
+  <w:num w:numId="8" w16cid:durableId="1935744732">
     <w:abstractNumId w:val="1"/>
+  </w:num>
+  <w:num w:numId="9" w16cid:durableId="682782023">
+    <w:abstractNumId w:val="3"/>
   </w:num>
 </w:numbering>
 </file>
@@ -1993,6 +2978,41 @@
     <w:uiPriority w:val="99"/>
     <w:rsid w:val="00A3683A"/>
   </w:style>
+  <w:style w:type="character" w:styleId="Hyperlink">
+    <w:name w:val="Hyperlink"/>
+    <w:basedOn w:val="DefaultParagraphFont"/>
+    <w:uiPriority w:val="99"/>
+    <w:unhideWhenUsed/>
+    <w:rsid w:val="003C0AE3"/>
+    <w:rPr>
+      <w:color w:val="467886" w:themeColor="hyperlink"/>
+      <w:u w:val="single"/>
+    </w:rPr>
+  </w:style>
+  <w:style w:type="character" w:styleId="UnresolvedMention">
+    <w:name w:val="Unresolved Mention"/>
+    <w:basedOn w:val="DefaultParagraphFont"/>
+    <w:uiPriority w:val="99"/>
+    <w:semiHidden/>
+    <w:unhideWhenUsed/>
+    <w:rsid w:val="003C0AE3"/>
+    <w:rPr>
+      <w:color w:val="605E5C"/>
+      <w:shd w:val="clear" w:color="auto" w:fill="E1DFDD"/>
+    </w:rPr>
+  </w:style>
+  <w:style w:type="character" w:styleId="FollowedHyperlink">
+    <w:name w:val="FollowedHyperlink"/>
+    <w:basedOn w:val="DefaultParagraphFont"/>
+    <w:uiPriority w:val="99"/>
+    <w:semiHidden/>
+    <w:unhideWhenUsed/>
+    <w:rsid w:val="0017047E"/>
+    <w:rPr>
+      <w:color w:val="96607D" w:themeColor="followedHyperlink"/>
+      <w:u w:val="single"/>
+    </w:rPr>
+  </w:style>
 </w:styles>
 </file>
 

</xml_diff>